<commit_message>
Document SYNC-6 atomic expansion and context specialization
</commit_message>
<xml_diff>
--- a/doc/DSC_FHE_Compiler_Architecture_and_Integration_Plan_v0.10.docx
+++ b/doc/DSC_FHE_Compiler_Architecture_and_Integration_Plan_v0.10.docx
@@ -14713,6 +14713,47 @@
     <w:p>
       <w:r>
         <w:t>Type propagation, scheme-state propagation, and placement optimization are three distinct compiler responsibilities. Section 6.4 determines Cipher/Plain type. Section 11.3 computes CKKS scale/level transfer functions. Section 11.4 guarantees an executable correctness baseline at -O0. ReSBM is allowed to replace that provisional placement only when optimization and bootstrap policy permit it. HPOLY/HPAO must consume the finalized CKKS scale/bootstrap schedule rather than attempting to rediscover bootstrap placement.</w:t>
+      </w:r>
+    </w:p>
+    <w:p>
+      <w:pPr>
+        <w:pStyle w:val="Heading2"/>
+        <w:keepLines/>
+      </w:pPr>
+      <w:r>
+        <w:t>11.9 SYNC-6 Executable Context Identity</w:t>
+      </w:r>
+    </w:p>
+    <w:p>
+      <w:pPr>
+        <w:keepLines/>
+      </w:pPr>
+      <w:r>
+        <w:t>The source ResNet-20 capture has six PUs and nine block callsites. Its certified CKKS plan has nineteen ReLU contexts, not nineteen independent source definitions. Three shared block PUs are called with incompatible ordered post-refresh levels: (15,15) versus (15,18) in two block families, and (15,15) versus (15,17) in a third. One executable result value in a shared PU cannot have both states. The source definition, callsite, approved range, and CKKS state identities must remain connected through lowering; canonical tensor TY is not changed to encode a context-specific level.</w:t>
+      </w:r>
+    </w:p>
+    <w:p>
+      <w:pPr>
+        <w:keepLines/>
+      </w:pPr>
+      <w:r>
+        <w:t>At -O0, specialize a PU by its complete ordered executable CKKS signature: operators, operand types, encrypted layout, key needs, level/scale/precision transitions, and refresh schedule. Reuse a clone only when those facts agree. The preferred ABI passes each approved context-specific normalization bound B as an exact-TY plaintext formal and caller actual. A block with two ReLUs needs two independently bound values unless their equality is proved. The observed ReLU signatures imply at least nine executable PUs under this ABI, subject to full-graph CKKS verification. A reviewed fallback may embed B in a context-specialized body, potentially requiring ten PUs. That choice is keyed by the complete signature including bound bytes, never by call ordinal or TCON index alone. Metadata-only B selection is not executable semantics.</w:t>
+      </w:r>
+    </w:p>
+    <w:p>
+      <w:pPr>
+        <w:keepLines/>
+      </w:pPr>
+      <w:r>
+        <w:t>Reuse Open64 IPO_CLONE tree, symtab, map, and DST machinery where legal, but wrap it in a generic owner-safe transaction that updates DSL/FHE values, REGIONs, formals, call ABI, callsites, states, and origin relations with the physical PUs and calls. CKKS one-to-many source-value expansion is a separate atomic transaction. Read-only preflight is necessary but not sufficient: stage new nodes, symbols, rows, and use redirects, and provide explicit rollback for every fallible commit action. A rejected request leaves the program unchanged and a failed checkpoint publishes no partial binary. Each resulting CKKS step has a typed link to its source static event and its own value-specific state.</w:t>
+      </w:r>
+    </w:p>
+    <w:p>
+      <w:pPr>
+        <w:keepLines/>
+      </w:pPr>
+      <w:r>
+        <w:t>Certify provider-independent executable CKKS WHIRL before ACE interaction. Use the existing Open64 stable-C-ABI mock for terminal lowering comparison; do not add another mock during CKKS IR development. Admit ACE only after a new reviewed pin provides an evaluation-only context and versioned public/evaluation-key and ciphertext import/export. An evaluator retaining a decryptor or key generator does not meet the secretless server requirement. See FHE-SYNC6-CKKS-IR-CONFORMANCE-GATE.md, FHE-SYNC6-CONTEXT-SPECIALIZATION-CONTRACT.md, and FHE-SYNC6-ACE-ANT-ADMISSION-AUDIT.md for implementation gates.</w:t>
       </w:r>
     </w:p>
     <w:p>

</xml_diff>